<commit_message>
docs: add \"Where to see\" navigation paths to all round 4 deep audit items
Every item across all 9 deep audit docs now carries a \"Where to see\"
line above \"Where it stood\". The path tells the dev exactly how to
navigate to the issue: page → section → element, with state hints
(\"in dark mode\", \"hover any row\", \"click any card\") where the
issue only surfaces under specific conditions.

Surfaces covered:
- TopNav (5 items)
- Home page (12 items)
- Service Kanban + Card Modal (30 items)
- Ops page (18 items)
- Analytics page (12 items)
- Weekly WIP page (9 items)
- Templates page (15 items)
- Account Settings (20 items)
- Clients page (28 items)

Total: ~149 navigation paths added.

Builders updated to render \"Where to see\" before \"Where it stood\"
in both PDF and DOCX output. Field is optional; items without a path
fall through gracefully.

Co-Authored-By: Claude Opus 4.7 <noreply@anthropic.com>
</commit_message>
<xml_diff>
--- a/docs/qa-comparison/account-settings-qa-round4-deep.docx
+++ b/docs/qa-comparison/account-settings-qa-round4-deep.docx
@@ -227,6 +227,27 @@
         </w:tc>
       </w:tr>
     </w:tbl>
+    <w:p>
+      <w:pPr>
+        <w:spacing w:after="60"/>
+        <w:ind w:left="230"/>
+      </w:pPr>
+      <w:r>
+        <w:rPr>
+          <w:b/>
+          <w:color w:val="1A1A1A"/>
+          <w:sz w:val="20"/>
+        </w:rPr>
+        <w:t xml:space="preserve">Where to see: </w:t>
+      </w:r>
+      <w:r>
+        <w:rPr>
+          <w:color w:val="1A1A1A"/>
+          <w:sz w:val="20"/>
+        </w:rPr>
+        <w:t>Click your avatar at top right → look at the dropdown items.</w:t>
+      </w:r>
+    </w:p>
     <w:p>
       <w:pPr>
         <w:spacing w:after="60"/>
@@ -566,6 +587,27 @@
           <w:color w:val="1A1A1A"/>
           <w:sz w:val="20"/>
         </w:rPr>
+        <w:t xml:space="preserve">Where to see: </w:t>
+      </w:r>
+      <w:r>
+        <w:rPr>
+          <w:color w:val="1A1A1A"/>
+          <w:sz w:val="20"/>
+        </w:rPr>
+        <w:t>Account Settings modal → sidebar → Workspace group → Trash. Read the section subtitle.</w:t>
+      </w:r>
+    </w:p>
+    <w:p>
+      <w:pPr>
+        <w:spacing w:after="60"/>
+        <w:ind w:left="230"/>
+      </w:pPr>
+      <w:r>
+        <w:rPr>
+          <w:b/>
+          <w:color w:val="1A1A1A"/>
+          <w:sz w:val="20"/>
+        </w:rPr>
         <w:t xml:space="preserve">Where it stood: </w:t>
       </w:r>
       <w:r>
@@ -719,6 +761,27 @@
         </w:tc>
       </w:tr>
     </w:tbl>
+    <w:p>
+      <w:pPr>
+        <w:spacing w:after="60"/>
+        <w:ind w:left="230"/>
+      </w:pPr>
+      <w:r>
+        <w:rPr>
+          <w:b/>
+          <w:color w:val="1A1A1A"/>
+          <w:sz w:val="20"/>
+        </w:rPr>
+        <w:t xml:space="preserve">Where to see: </w:t>
+      </w:r>
+      <w:r>
+        <w:rPr>
+          <w:color w:val="1A1A1A"/>
+          <w:sz w:val="20"/>
+        </w:rPr>
+        <w:t>Account Settings modal → sidebar → Workspace group → Trash. Read the empty state copy.</w:t>
+      </w:r>
+    </w:p>
     <w:p>
       <w:pPr>
         <w:spacing w:after="60"/>
@@ -894,6 +957,27 @@
           <w:color w:val="1A1A1A"/>
           <w:sz w:val="20"/>
         </w:rPr>
+        <w:t xml:space="preserve">Where to see: </w:t>
+      </w:r>
+      <w:r>
+        <w:rPr>
+          <w:color w:val="1A1A1A"/>
+          <w:sz w:val="20"/>
+        </w:rPr>
+        <w:t>Account Settings modal → sidebar → Workspace group → Members. Look at the right column on each row (mix of job titles + access roles).</w:t>
+      </w:r>
+    </w:p>
+    <w:p>
+      <w:pPr>
+        <w:spacing w:after="60"/>
+        <w:ind w:left="230"/>
+      </w:pPr>
+      <w:r>
+        <w:rPr>
+          <w:b/>
+          <w:color w:val="1A1A1A"/>
+          <w:sz w:val="20"/>
+        </w:rPr>
         <w:t xml:space="preserve">Where it stood: </w:t>
       </w:r>
       <w:r>
@@ -1047,6 +1131,27 @@
         </w:tc>
       </w:tr>
     </w:tbl>
+    <w:p>
+      <w:pPr>
+        <w:spacing w:after="60"/>
+        <w:ind w:left="230"/>
+      </w:pPr>
+      <w:r>
+        <w:rPr>
+          <w:b/>
+          <w:color w:val="1A1A1A"/>
+          <w:sz w:val="20"/>
+        </w:rPr>
+        <w:t xml:space="preserve">Where to see: </w:t>
+      </w:r>
+      <w:r>
+        <w:rPr>
+          <w:color w:val="1A1A1A"/>
+          <w:sz w:val="20"/>
+        </w:rPr>
+        <w:t>Account Settings modal → sidebar → My Account group → Profile → ROLE / TITLE field placeholder.</w:t>
+      </w:r>
+    </w:p>
     <w:p>
       <w:pPr>
         <w:spacing w:after="60"/>
@@ -1222,6 +1327,27 @@
           <w:color w:val="1A1A1A"/>
           <w:sz w:val="20"/>
         </w:rPr>
+        <w:t xml:space="preserve">Where to see: </w:t>
+      </w:r>
+      <w:r>
+        <w:rPr>
+          <w:color w:val="1A1A1A"/>
+          <w:sz w:val="20"/>
+        </w:rPr>
+        <w:t>Account Settings modal → sidebar → Workspace group → Holidays. Hover over a holiday row to see if edit/delete actions appear.</w:t>
+      </w:r>
+    </w:p>
+    <w:p>
+      <w:pPr>
+        <w:spacing w:after="60"/>
+        <w:ind w:left="230"/>
+      </w:pPr>
+      <w:r>
+        <w:rPr>
+          <w:b/>
+          <w:color w:val="1A1A1A"/>
+          <w:sz w:val="20"/>
+        </w:rPr>
         <w:t xml:space="preserve">Where it stood: </w:t>
       </w:r>
       <w:r>
@@ -1386,6 +1512,27 @@
           <w:color w:val="1A1A1A"/>
           <w:sz w:val="20"/>
         </w:rPr>
+        <w:t xml:space="preserve">Where to see: </w:t>
+      </w:r>
+      <w:r>
+        <w:rPr>
+          <w:color w:val="1A1A1A"/>
+          <w:sz w:val="20"/>
+        </w:rPr>
+        <w:t>Account Settings modal → sidebar → Workspace group → Holidays. Look above the list for country filter chips.</w:t>
+      </w:r>
+    </w:p>
+    <w:p>
+      <w:pPr>
+        <w:spacing w:after="60"/>
+        <w:ind w:left="230"/>
+      </w:pPr>
+      <w:r>
+        <w:rPr>
+          <w:b/>
+          <w:color w:val="1A1A1A"/>
+          <w:sz w:val="20"/>
+        </w:rPr>
         <w:t xml:space="preserve">Where it stood: </w:t>
       </w:r>
       <w:r>
@@ -1539,6 +1686,27 @@
         </w:tc>
       </w:tr>
     </w:tbl>
+    <w:p>
+      <w:pPr>
+        <w:spacing w:after="60"/>
+        <w:ind w:left="230"/>
+      </w:pPr>
+      <w:r>
+        <w:rPr>
+          <w:b/>
+          <w:color w:val="1A1A1A"/>
+          <w:sz w:val="20"/>
+        </w:rPr>
+        <w:t xml:space="preserve">Where to see: </w:t>
+      </w:r>
+      <w:r>
+        <w:rPr>
+          <w:color w:val="1A1A1A"/>
+          <w:sz w:val="20"/>
+        </w:rPr>
+        <w:t>Account Settings modal → sidebar → Workspace group → Holidays. Look for a credit-expiry policy radio.</w:t>
+      </w:r>
+    </w:p>
     <w:p>
       <w:pPr>
         <w:spacing w:after="60"/>
@@ -1747,6 +1915,27 @@
           <w:color w:val="1A1A1A"/>
           <w:sz w:val="20"/>
         </w:rPr>
+        <w:t xml:space="preserve">Where to see: </w:t>
+      </w:r>
+      <w:r>
+        <w:rPr>
+          <w:color w:val="1A1A1A"/>
+          <w:sz w:val="20"/>
+        </w:rPr>
+        <w:t>Click your avatar at top right → Account settings. The modal opens.</w:t>
+      </w:r>
+    </w:p>
+    <w:p>
+      <w:pPr>
+        <w:spacing w:after="60"/>
+        <w:ind w:left="230"/>
+      </w:pPr>
+      <w:r>
+        <w:rPr>
+          <w:b/>
+          <w:color w:val="1A1A1A"/>
+          <w:sz w:val="20"/>
+        </w:rPr>
         <w:t xml:space="preserve">Where it stood: </w:t>
       </w:r>
       <w:r>
@@ -1923,6 +2112,27 @@
           <w:color w:val="1A1A1A"/>
           <w:sz w:val="20"/>
         </w:rPr>
+        <w:t xml:space="preserve">Where to see: </w:t>
+      </w:r>
+      <w:r>
+        <w:rPr>
+          <w:color w:val="1A1A1A"/>
+          <w:sz w:val="20"/>
+        </w:rPr>
+        <w:t>Account Settings modal → sidebar → My Account group → Profile.</w:t>
+      </w:r>
+    </w:p>
+    <w:p>
+      <w:pPr>
+        <w:spacing w:after="60"/>
+        <w:ind w:left="230"/>
+      </w:pPr>
+      <w:r>
+        <w:rPr>
+          <w:b/>
+          <w:color w:val="1A1A1A"/>
+          <w:sz w:val="20"/>
+        </w:rPr>
         <w:t xml:space="preserve">Where it stood: </w:t>
       </w:r>
       <w:r>
@@ -2055,6 +2265,27 @@
         </w:tc>
       </w:tr>
     </w:tbl>
+    <w:p>
+      <w:pPr>
+        <w:spacing w:after="60"/>
+        <w:ind w:left="230"/>
+      </w:pPr>
+      <w:r>
+        <w:rPr>
+          <w:b/>
+          <w:color w:val="1A1A1A"/>
+          <w:sz w:val="20"/>
+        </w:rPr>
+        <w:t xml:space="preserve">Where to see: </w:t>
+      </w:r>
+      <w:r>
+        <w:rPr>
+          <w:color w:val="1A1A1A"/>
+          <w:sz w:val="20"/>
+        </w:rPr>
+        <w:t>Account Settings modal → sidebar → My Account group → Profile → bottom of the section. Look for 'Load demo data' button.</w:t>
+      </w:r>
+    </w:p>
     <w:p>
       <w:pPr>
         <w:spacing w:after="60"/>
@@ -2209,6 +2440,27 @@
           <w:color w:val="1A1A1A"/>
           <w:sz w:val="20"/>
         </w:rPr>
+        <w:t xml:space="preserve">Where to see: </w:t>
+      </w:r>
+      <w:r>
+        <w:rPr>
+          <w:color w:val="1A1A1A"/>
+          <w:sz w:val="20"/>
+        </w:rPr>
+        <w:t>Account Settings modal → sidebar → My Account group → Preferences.</w:t>
+      </w:r>
+    </w:p>
+    <w:p>
+      <w:pPr>
+        <w:spacing w:after="60"/>
+        <w:ind w:left="230"/>
+      </w:pPr>
+      <w:r>
+        <w:rPr>
+          <w:b/>
+          <w:color w:val="1A1A1A"/>
+          <w:sz w:val="20"/>
+        </w:rPr>
         <w:t xml:space="preserve">Where it stood: </w:t>
       </w:r>
       <w:r>
@@ -2341,6 +2593,27 @@
         </w:tc>
       </w:tr>
     </w:tbl>
+    <w:p>
+      <w:pPr>
+        <w:spacing w:after="60"/>
+        <w:ind w:left="230"/>
+      </w:pPr>
+      <w:r>
+        <w:rPr>
+          <w:b/>
+          <w:color w:val="1A1A1A"/>
+          <w:sz w:val="20"/>
+        </w:rPr>
+        <w:t xml:space="preserve">Where to see: </w:t>
+      </w:r>
+      <w:r>
+        <w:rPr>
+          <w:color w:val="1A1A1A"/>
+          <w:sz w:val="20"/>
+        </w:rPr>
+        <w:t>Account Settings modal → sidebar → My Account group → Notifications.</w:t>
+      </w:r>
+    </w:p>
     <w:p>
       <w:pPr>
         <w:spacing w:after="60"/>
@@ -2516,6 +2789,27 @@
           <w:color w:val="1A1A1A"/>
           <w:sz w:val="20"/>
         </w:rPr>
+        <w:t xml:space="preserve">Where to see: </w:t>
+      </w:r>
+      <w:r>
+        <w:rPr>
+          <w:color w:val="1A1A1A"/>
+          <w:sz w:val="20"/>
+        </w:rPr>
+        <w:t>Account Settings modal → sidebar → My Account group → Time off.</w:t>
+      </w:r>
+    </w:p>
+    <w:p>
+      <w:pPr>
+        <w:spacing w:after="60"/>
+        <w:ind w:left="230"/>
+      </w:pPr>
+      <w:r>
+        <w:rPr>
+          <w:b/>
+          <w:color w:val="1A1A1A"/>
+          <w:sz w:val="20"/>
+        </w:rPr>
         <w:t xml:space="preserve">Where it stood: </w:t>
       </w:r>
       <w:r>
@@ -2680,6 +2974,27 @@
           <w:color w:val="1A1A1A"/>
           <w:sz w:val="20"/>
         </w:rPr>
+        <w:t xml:space="preserve">Where to see: </w:t>
+      </w:r>
+      <w:r>
+        <w:rPr>
+          <w:color w:val="1A1A1A"/>
+          <w:sz w:val="20"/>
+        </w:rPr>
+        <w:t>Account Settings modal → sidebar → Workspace group → Members.</w:t>
+      </w:r>
+    </w:p>
+    <w:p>
+      <w:pPr>
+        <w:spacing w:after="60"/>
+        <w:ind w:left="230"/>
+      </w:pPr>
+      <w:r>
+        <w:rPr>
+          <w:b/>
+          <w:color w:val="1A1A1A"/>
+          <w:sz w:val="20"/>
+        </w:rPr>
         <w:t xml:space="preserve">Where it stood: </w:t>
       </w:r>
       <w:r>
@@ -2812,6 +3127,27 @@
         </w:tc>
       </w:tr>
     </w:tbl>
+    <w:p>
+      <w:pPr>
+        <w:spacing w:after="60"/>
+        <w:ind w:left="230"/>
+      </w:pPr>
+      <w:r>
+        <w:rPr>
+          <w:b/>
+          <w:color w:val="1A1A1A"/>
+          <w:sz w:val="20"/>
+        </w:rPr>
+        <w:t xml:space="preserve">Where to see: </w:t>
+      </w:r>
+      <w:r>
+        <w:rPr>
+          <w:color w:val="1A1A1A"/>
+          <w:sz w:val="20"/>
+        </w:rPr>
+        <w:t>Account Settings modal → sidebar → Workspace group → Job titles.</w:t>
+      </w:r>
+    </w:p>
     <w:p>
       <w:pPr>
         <w:spacing w:after="60"/>
@@ -2966,6 +3302,27 @@
           <w:color w:val="1A1A1A"/>
           <w:sz w:val="20"/>
         </w:rPr>
+        <w:t xml:space="preserve">Where to see: </w:t>
+      </w:r>
+      <w:r>
+        <w:rPr>
+          <w:color w:val="1A1A1A"/>
+          <w:sz w:val="20"/>
+        </w:rPr>
+        <w:t>Account Settings modal → sidebar → Workspace group → Trash → empty state icon.</w:t>
+      </w:r>
+    </w:p>
+    <w:p>
+      <w:pPr>
+        <w:spacing w:after="60"/>
+        <w:ind w:left="230"/>
+      </w:pPr>
+      <w:r>
+        <w:rPr>
+          <w:b/>
+          <w:color w:val="1A1A1A"/>
+          <w:sz w:val="20"/>
+        </w:rPr>
         <w:t xml:space="preserve">Where it stood: </w:t>
       </w:r>
       <w:r>
@@ -3098,6 +3455,27 @@
         </w:tc>
       </w:tr>
     </w:tbl>
+    <w:p>
+      <w:pPr>
+        <w:spacing w:after="60"/>
+        <w:ind w:left="230"/>
+      </w:pPr>
+      <w:r>
+        <w:rPr>
+          <w:b/>
+          <w:color w:val="1A1A1A"/>
+          <w:sz w:val="20"/>
+        </w:rPr>
+        <w:t xml:space="preserve">Where to see: </w:t>
+      </w:r>
+      <w:r>
+        <w:rPr>
+          <w:color w:val="1A1A1A"/>
+          <w:sz w:val="20"/>
+        </w:rPr>
+        <w:t>Account Settings modal → sidebar → Account group → Sign-in.</w:t>
+      </w:r>
+    </w:p>
     <w:p>
       <w:pPr>
         <w:spacing w:after="60"/>
@@ -3262,6 +3640,27 @@
         </w:tc>
       </w:tr>
     </w:tbl>
+    <w:p>
+      <w:pPr>
+        <w:spacing w:after="60"/>
+        <w:ind w:left="230"/>
+      </w:pPr>
+      <w:r>
+        <w:rPr>
+          <w:b/>
+          <w:color w:val="1A1A1A"/>
+          <w:sz w:val="20"/>
+        </w:rPr>
+        <w:t xml:space="preserve">Where to see: </w:t>
+      </w:r>
+      <w:r>
+        <w:rPr>
+          <w:color w:val="1A1A1A"/>
+          <w:sz w:val="20"/>
+        </w:rPr>
+        <w:t>Account Settings modal → bottom right of the modal (Cancel + Save buttons), top right (X close), top center (modal title).</w:t>
+      </w:r>
+    </w:p>
     <w:p>
       <w:pPr>
         <w:spacing w:after="60"/>

</xml_diff>